<commit_message>
fix: remoção da pagina guia. docs: ajuste na documentação, ajuste no der
</commit_message>
<xml_diff>
--- a/DOCUMENTACAO/PI-DOCUMENTACAO.docx
+++ b/DOCUMENTACAO/PI-DOCUMENTACAO.docx
@@ -21,8 +21,20 @@
           <w:sz w:val="22"/>
           <w:szCs w:val="22"/>
         </w:rPr>
-        <w:t>São Paulo Tech School</w:t>
-      </w:r>
+        <w:t xml:space="preserve">São Paulo Tech </w:t>
+      </w:r>
+      <w:proofErr w:type="spellStart"/>
+      <w:r>
+        <w:rPr>
+          <w:rFonts w:ascii="Monospac821 BT" w:eastAsia="Arial" w:hAnsi="Monospac821 BT" w:cs="Arial"/>
+          <w:b/>
+          <w:color w:val="000000" w:themeColor="text1"/>
+          <w:sz w:val="22"/>
+          <w:szCs w:val="22"/>
+        </w:rPr>
+        <w:t>School</w:t>
+      </w:r>
+      <w:proofErr w:type="spellEnd"/>
     </w:p>
     <w:p>
       <w:pPr>
@@ -427,7 +439,55 @@
           <w:rFonts w:ascii="Monospac821 BT" w:eastAsia="Arial" w:hAnsi="Monospac821 BT" w:cs="Arial"/>
           <w:color w:val="000000" w:themeColor="text1"/>
         </w:rPr>
-        <w:t>O Shaco é um personagem do jogo League of Legends, desenvolvido pela Riot Games e lançado em 2009. O jogo pertence ao gênero MOBA (Multiplayer Online Battle Arena) e consiste em confrontos estratégicos entre equipes, que utilizam diferentes recursos e habilidades com o objetivo de destruir a base inimiga.</w:t>
+        <w:t xml:space="preserve">O </w:t>
+      </w:r>
+      <w:proofErr w:type="spellStart"/>
+      <w:r>
+        <w:rPr>
+          <w:rFonts w:ascii="Monospac821 BT" w:eastAsia="Arial" w:hAnsi="Monospac821 BT" w:cs="Arial"/>
+          <w:color w:val="000000" w:themeColor="text1"/>
+        </w:rPr>
+        <w:t>Shaco</w:t>
+      </w:r>
+      <w:proofErr w:type="spellEnd"/>
+      <w:r>
+        <w:rPr>
+          <w:rFonts w:ascii="Monospac821 BT" w:eastAsia="Arial" w:hAnsi="Monospac821 BT" w:cs="Arial"/>
+          <w:color w:val="000000" w:themeColor="text1"/>
+        </w:rPr>
+        <w:t xml:space="preserve"> é um personagem do jogo League </w:t>
+      </w:r>
+      <w:proofErr w:type="spellStart"/>
+      <w:r>
+        <w:rPr>
+          <w:rFonts w:ascii="Monospac821 BT" w:eastAsia="Arial" w:hAnsi="Monospac821 BT" w:cs="Arial"/>
+          <w:color w:val="000000" w:themeColor="text1"/>
+        </w:rPr>
+        <w:t>of</w:t>
+      </w:r>
+      <w:proofErr w:type="spellEnd"/>
+      <w:r>
+        <w:rPr>
+          <w:rFonts w:ascii="Monospac821 BT" w:eastAsia="Arial" w:hAnsi="Monospac821 BT" w:cs="Arial"/>
+          <w:color w:val="000000" w:themeColor="text1"/>
+        </w:rPr>
+        <w:t xml:space="preserve"> Legends, desenvolvido pela Riot Games e lançado em 2009. O jogo pertence ao gênero MOBA (Multiplayer Online </w:t>
+      </w:r>
+      <w:proofErr w:type="spellStart"/>
+      <w:r>
+        <w:rPr>
+          <w:rFonts w:ascii="Monospac821 BT" w:eastAsia="Arial" w:hAnsi="Monospac821 BT" w:cs="Arial"/>
+          <w:color w:val="000000" w:themeColor="text1"/>
+        </w:rPr>
+        <w:t>Battle</w:t>
+      </w:r>
+      <w:proofErr w:type="spellEnd"/>
+      <w:r>
+        <w:rPr>
+          <w:rFonts w:ascii="Monospac821 BT" w:eastAsia="Arial" w:hAnsi="Monospac821 BT" w:cs="Arial"/>
+          <w:color w:val="000000" w:themeColor="text1"/>
+        </w:rPr>
+        <w:t xml:space="preserve"> Arena) e consiste em confrontos estratégicos entre equipes, que utilizam diferentes recursos e habilidades com o objetivo de destruir a base inimiga.</w:t>
       </w:r>
     </w:p>
     <w:p>
@@ -443,7 +503,39 @@
           <w:rFonts w:ascii="Monospac821 BT" w:eastAsia="Arial" w:hAnsi="Monospac821 BT" w:cs="Arial"/>
           <w:color w:val="000000" w:themeColor="text1"/>
         </w:rPr>
-        <w:t>Ao longo dos anos, League of Legends se consolidou como um dos jogos mais populares do mundo, com milhões de jogadores ativos e forte presença no cenário competitivo. Dentro desse contexto, Shaco se destaca como um personagem de nicho, geralmente escolhido por jogadores que preferem um estilo de jogo mais criativo, estratégico e voltado à imprevisibilidade.</w:t>
+        <w:t xml:space="preserve">Ao longo dos anos, League </w:t>
+      </w:r>
+      <w:proofErr w:type="spellStart"/>
+      <w:r>
+        <w:rPr>
+          <w:rFonts w:ascii="Monospac821 BT" w:eastAsia="Arial" w:hAnsi="Monospac821 BT" w:cs="Arial"/>
+          <w:color w:val="000000" w:themeColor="text1"/>
+        </w:rPr>
+        <w:t>of</w:t>
+      </w:r>
+      <w:proofErr w:type="spellEnd"/>
+      <w:r>
+        <w:rPr>
+          <w:rFonts w:ascii="Monospac821 BT" w:eastAsia="Arial" w:hAnsi="Monospac821 BT" w:cs="Arial"/>
+          <w:color w:val="000000" w:themeColor="text1"/>
+        </w:rPr>
+        <w:t xml:space="preserve"> Legends se consolidou como um dos jogos mais populares do mundo, com milhões de jogadores ativos e forte presença no cenário competitivo. Dentro desse contexto, </w:t>
+      </w:r>
+      <w:proofErr w:type="spellStart"/>
+      <w:r>
+        <w:rPr>
+          <w:rFonts w:ascii="Monospac821 BT" w:eastAsia="Arial" w:hAnsi="Monospac821 BT" w:cs="Arial"/>
+          <w:color w:val="000000" w:themeColor="text1"/>
+        </w:rPr>
+        <w:t>Shaco</w:t>
+      </w:r>
+      <w:proofErr w:type="spellEnd"/>
+      <w:r>
+        <w:rPr>
+          <w:rFonts w:ascii="Monospac821 BT" w:eastAsia="Arial" w:hAnsi="Monospac821 BT" w:cs="Arial"/>
+          <w:color w:val="000000" w:themeColor="text1"/>
+        </w:rPr>
+        <w:t xml:space="preserve"> se destaca como um personagem de nicho, geralmente escolhido por jogadores que preferem um estilo de jogo mais criativo, estratégico e voltado à imprevisibilidade.</w:t>
       </w:r>
     </w:p>
     <w:p>
@@ -459,7 +551,23 @@
           <w:rFonts w:ascii="Monospac821 BT" w:eastAsia="Arial" w:hAnsi="Monospac821 BT" w:cs="Arial"/>
           <w:color w:val="000000" w:themeColor="text1"/>
         </w:rPr>
-        <w:t>A origem de Shaco dentro do universo do jogo não é totalmente definida de forma clara, sendo frequentemente associada a uma entidade sombria e misteriosa. Sua jogabilidade é marcada pela imprevisibilidade, sendo baseada no engano e na manipulação do oponente, utilizando habilidades como invisibilidade e criação de ilusões para confundir os adversários.</w:t>
+        <w:t xml:space="preserve">A origem de </w:t>
+      </w:r>
+      <w:proofErr w:type="spellStart"/>
+      <w:r>
+        <w:rPr>
+          <w:rFonts w:ascii="Monospac821 BT" w:eastAsia="Arial" w:hAnsi="Monospac821 BT" w:cs="Arial"/>
+          <w:color w:val="000000" w:themeColor="text1"/>
+        </w:rPr>
+        <w:t>Shaco</w:t>
+      </w:r>
+      <w:proofErr w:type="spellEnd"/>
+      <w:r>
+        <w:rPr>
+          <w:rFonts w:ascii="Monospac821 BT" w:eastAsia="Arial" w:hAnsi="Monospac821 BT" w:cs="Arial"/>
+          <w:color w:val="000000" w:themeColor="text1"/>
+        </w:rPr>
+        <w:t xml:space="preserve"> dentro do universo do jogo não é totalmente definida de forma clara, sendo frequentemente associada a uma entidade sombria e misteriosa. Sua jogabilidade é marcada pela imprevisibilidade, sendo baseada no engano e na manipulação do oponente, utilizando habilidades como invisibilidade e criação de ilusões para confundir os adversários.</w:t>
       </w:r>
     </w:p>
     <w:p>
@@ -475,7 +583,23 @@
           <w:rFonts w:ascii="Monospac821 BT" w:eastAsia="Arial" w:hAnsi="Monospac821 BT" w:cs="Arial"/>
           <w:color w:val="000000" w:themeColor="text1"/>
         </w:rPr>
-        <w:t>Jogar com Shaco exige do jogador uma leitura mais aprofundada do jogo e das decisões do adversário, explorando aspectos psicológicos e estratégicos. Sua proposta gira em torno da dúvida constante, onde o oponente raramente tem certeza de suas ações ou posicionamento.</w:t>
+        <w:t xml:space="preserve">Jogar com </w:t>
+      </w:r>
+      <w:proofErr w:type="spellStart"/>
+      <w:r>
+        <w:rPr>
+          <w:rFonts w:ascii="Monospac821 BT" w:eastAsia="Arial" w:hAnsi="Monospac821 BT" w:cs="Arial"/>
+          <w:color w:val="000000" w:themeColor="text1"/>
+        </w:rPr>
+        <w:t>Shaco</w:t>
+      </w:r>
+      <w:proofErr w:type="spellEnd"/>
+      <w:r>
+        <w:rPr>
+          <w:rFonts w:ascii="Monospac821 BT" w:eastAsia="Arial" w:hAnsi="Monospac821 BT" w:cs="Arial"/>
+          <w:color w:val="000000" w:themeColor="text1"/>
+        </w:rPr>
+        <w:t xml:space="preserve"> exige do jogador uma leitura mais aprofundada do jogo e das decisões do adversário, explorando aspectos psicológicos e estratégicos. Sua proposta gira em torno da dúvida constante, onde o oponente raramente tem certeza de suas ações ou posicionamento.</w:t>
       </w:r>
     </w:p>
     <w:p>
@@ -534,7 +658,23 @@
           <w:rFonts w:ascii="Monospac821 BT" w:eastAsia="Arial" w:hAnsi="Monospac821 BT" w:cs="Arial"/>
           <w:color w:val="000000" w:themeColor="text1"/>
         </w:rPr>
-        <w:t xml:space="preserve">, um website inspirado no personagem Shaco, contendo uma página de apresentação, um sistema de cadastro </w:t>
+        <w:t xml:space="preserve">, um website inspirado no personagem </w:t>
+      </w:r>
+      <w:proofErr w:type="spellStart"/>
+      <w:r>
+        <w:rPr>
+          <w:rFonts w:ascii="Monospac821 BT" w:eastAsia="Arial" w:hAnsi="Monospac821 BT" w:cs="Arial"/>
+          <w:color w:val="000000" w:themeColor="text1"/>
+        </w:rPr>
+        <w:t>Shaco</w:t>
+      </w:r>
+      <w:proofErr w:type="spellEnd"/>
+      <w:r>
+        <w:rPr>
+          <w:rFonts w:ascii="Monospac821 BT" w:eastAsia="Arial" w:hAnsi="Monospac821 BT" w:cs="Arial"/>
+          <w:color w:val="000000" w:themeColor="text1"/>
+        </w:rPr>
+        <w:t xml:space="preserve">, contendo uma página de apresentação, um sistema de cadastro </w:t>
       </w:r>
       <w:r>
         <w:rPr>
@@ -659,7 +799,23 @@
           <w:rFonts w:ascii="Monospac821 BT" w:eastAsia="Arial" w:hAnsi="Monospac821 BT" w:cs="Arial"/>
           <w:color w:val="000000" w:themeColor="text1"/>
         </w:rPr>
-        <w:t>A escolha do tema se baseia no interesse pessoal pelo personagem Shaco,</w:t>
+        <w:t xml:space="preserve">A escolha do tema se baseia no interesse pessoal pelo personagem </w:t>
+      </w:r>
+      <w:proofErr w:type="spellStart"/>
+      <w:r>
+        <w:rPr>
+          <w:rFonts w:ascii="Monospac821 BT" w:eastAsia="Arial" w:hAnsi="Monospac821 BT" w:cs="Arial"/>
+          <w:color w:val="000000" w:themeColor="text1"/>
+        </w:rPr>
+        <w:t>Shaco</w:t>
+      </w:r>
+      <w:proofErr w:type="spellEnd"/>
+      <w:r>
+        <w:rPr>
+          <w:rFonts w:ascii="Monospac821 BT" w:eastAsia="Arial" w:hAnsi="Monospac821 BT" w:cs="Arial"/>
+          <w:color w:val="000000" w:themeColor="text1"/>
+        </w:rPr>
+        <w:t>,</w:t>
       </w:r>
       <w:r>
         <w:rPr>
@@ -759,7 +915,22 @@
     </w:p>
     <w:p>
       <w:pPr>
+        <w:jc w:val="both"/>
+        <w:rPr>
+          <w:rFonts w:ascii="Monospac821 BT" w:eastAsia="Arial" w:hAnsi="Monospac821 BT" w:cs="Arial"/>
+          <w:color w:val="000000" w:themeColor="text1"/>
+        </w:rPr>
+      </w:pPr>
+    </w:p>
+    <w:p>
+      <w:pPr>
         <w:jc w:val="center"/>
+        <w:rPr>
+          <w:rFonts w:ascii="Monospac821 BT" w:eastAsia="Arial" w:hAnsi="Monospac821 BT" w:cs="Arial"/>
+          <w:color w:val="000000" w:themeColor="text1"/>
+        </w:rPr>
+      </w:pPr>
+      <w:r>
         <w:rPr>
           <w:rFonts w:ascii="Monospac821 BT" w:eastAsia="Arial" w:hAnsi="Monospac821 BT" w:cs="Arial"/>
           <w:b/>
@@ -768,7 +939,40 @@
           <w:sz w:val="32"/>
           <w:szCs w:val="32"/>
         </w:rPr>
-      </w:pPr>
+        <w:t>RELAÇÃO COM ODS - ONU</w:t>
+      </w:r>
+    </w:p>
+    <w:p>
+      <w:pPr>
+        <w:jc w:val="both"/>
+        <w:rPr>
+          <w:rFonts w:ascii="Monospac821 BT" w:eastAsia="Arial" w:hAnsi="Monospac821 BT" w:cs="Arial"/>
+          <w:color w:val="000000" w:themeColor="text1"/>
+        </w:rPr>
+      </w:pPr>
+      <w:r>
+        <w:rPr>
+          <w:rFonts w:ascii="Monospac821 BT" w:eastAsia="Arial" w:hAnsi="Monospac821 BT" w:cs="Arial"/>
+          <w:color w:val="000000" w:themeColor="text1"/>
+        </w:rPr>
+        <w:t xml:space="preserve">O projeto possui relação indireta com a ODS 3 – Saúde e Bem-Estar da Organização das Nações Unidas. Jogos eletrônicos competitivos como League </w:t>
+      </w:r>
+      <w:proofErr w:type="spellStart"/>
+      <w:r>
+        <w:rPr>
+          <w:rFonts w:ascii="Monospac821 BT" w:eastAsia="Arial" w:hAnsi="Monospac821 BT" w:cs="Arial"/>
+          <w:color w:val="000000" w:themeColor="text1"/>
+        </w:rPr>
+        <w:t>of</w:t>
+      </w:r>
+      <w:proofErr w:type="spellEnd"/>
+      <w:r>
+        <w:rPr>
+          <w:rFonts w:ascii="Monospac821 BT" w:eastAsia="Arial" w:hAnsi="Monospac821 BT" w:cs="Arial"/>
+          <w:color w:val="000000" w:themeColor="text1"/>
+        </w:rPr>
+        <w:t xml:space="preserve"> Legends exigem dos jogadores habilidades cognitivas como raciocínio estratégico, tomada de decisão sob pressão, atenção, memória, coordenação motora e tempo de resposta.</w:t>
+      </w:r>
     </w:p>
     <w:p>
       <w:pPr>
@@ -821,7 +1025,23 @@
           <w:rFonts w:ascii="Monospac821 BT" w:eastAsia="Arial" w:hAnsi="Monospac821 BT" w:cs="Arial"/>
           <w:color w:val="000000" w:themeColor="text1"/>
         </w:rPr>
-        <w:t>projeto consiste no desenvolvimento de um website inspirado no personagem Shaco.</w:t>
+        <w:t xml:space="preserve">projeto consiste no desenvolvimento de um website inspirado no personagem </w:t>
+      </w:r>
+      <w:proofErr w:type="spellStart"/>
+      <w:r>
+        <w:rPr>
+          <w:rFonts w:ascii="Monospac821 BT" w:eastAsia="Arial" w:hAnsi="Monospac821 BT" w:cs="Arial"/>
+          <w:color w:val="000000" w:themeColor="text1"/>
+        </w:rPr>
+        <w:t>Shaco</w:t>
+      </w:r>
+      <w:proofErr w:type="spellEnd"/>
+      <w:r>
+        <w:rPr>
+          <w:rFonts w:ascii="Monospac821 BT" w:eastAsia="Arial" w:hAnsi="Monospac821 BT" w:cs="Arial"/>
+          <w:color w:val="000000" w:themeColor="text1"/>
+        </w:rPr>
+        <w:t>.</w:t>
       </w:r>
     </w:p>
     <w:p>
@@ -926,6 +1146,7 @@
           <w:rFonts w:ascii="Monospac821 BT" w:eastAsia="Arial" w:hAnsi="Monospac821 BT" w:cs="Arial"/>
           <w:color w:val="000000" w:themeColor="text1"/>
         </w:rPr>
+        <w:lastRenderedPageBreak/>
         <w:t>O projeto contemplará as seguintes funcionalidades:</w:t>
       </w:r>
     </w:p>
@@ -1115,6 +1336,7 @@
         </w:rPr>
         <w:t xml:space="preserve">, </w:t>
       </w:r>
+      <w:proofErr w:type="spellStart"/>
       <w:r>
         <w:rPr>
           <w:rFonts w:ascii="Monospac821 BT" w:eastAsia="Arial" w:hAnsi="Monospac821 BT" w:cs="Arial"/>
@@ -1124,6 +1346,7 @@
         </w:rPr>
         <w:t>JavaScript</w:t>
       </w:r>
+      <w:proofErr w:type="spellEnd"/>
       <w:r>
         <w:rPr>
           <w:rFonts w:ascii="Monospac821 BT" w:eastAsia="Arial" w:hAnsi="Monospac821 BT" w:cs="Arial"/>
@@ -1340,7 +1563,25 @@
           <w:rFonts w:ascii="Monospac821 BT" w:eastAsia="Arial" w:hAnsi="Monospac821 BT" w:cs="Arial"/>
           <w:color w:val="000000" w:themeColor="text1"/>
         </w:rPr>
-        <w:t xml:space="preserve"> com pagina inicial, cadastro, login e dashboard</w:t>
+        <w:t xml:space="preserve"> com </w:t>
+      </w:r>
+      <w:proofErr w:type="spellStart"/>
+      <w:proofErr w:type="gramStart"/>
+      <w:r>
+        <w:rPr>
+          <w:rFonts w:ascii="Monospac821 BT" w:eastAsia="Arial" w:hAnsi="Monospac821 BT" w:cs="Arial"/>
+          <w:color w:val="000000" w:themeColor="text1"/>
+        </w:rPr>
+        <w:t>pagina</w:t>
+      </w:r>
+      <w:proofErr w:type="spellEnd"/>
+      <w:proofErr w:type="gramEnd"/>
+      <w:r>
+        <w:rPr>
+          <w:rFonts w:ascii="Monospac821 BT" w:eastAsia="Arial" w:hAnsi="Monospac821 BT" w:cs="Arial"/>
+          <w:color w:val="000000" w:themeColor="text1"/>
+        </w:rPr>
+        <w:t xml:space="preserve"> inicial, cadastro, login e dashboard</w:t>
       </w:r>
     </w:p>
     <w:p>
@@ -1652,6 +1893,7 @@
           <w:rFonts w:ascii="Monospac821 BT" w:eastAsia="Arial" w:hAnsi="Monospac821 BT" w:cs="Arial"/>
           <w:color w:val="000000" w:themeColor="text1"/>
         </w:rPr>
+        <w:lastRenderedPageBreak/>
         <w:t>Tempo limitado ao período</w:t>
       </w:r>
       <w:r>
@@ -6718,7 +6960,6 @@
   <w:style w:type="character" w:default="1" w:styleId="Fontepargpadro">
     <w:name w:val="Default Paragraph Font"/>
     <w:uiPriority w:val="1"/>
-    <w:semiHidden/>
     <w:unhideWhenUsed/>
   </w:style>
   <w:style w:type="table" w:default="1" w:styleId="Tabelanormal">

</xml_diff>